<commit_message>
Update hotel analysis tooling and assets
</commit_message>
<xml_diff>
--- a/tools/dependency-analysis/apps/web/public/hotel-analysis/Assets/report template.docx
+++ b/tools/dependency-analysis/apps/web/public/hotel-analysis/Assets/report template.docx
@@ -7,220 +7,7 @@
         <w:pStyle w:val="CoverPageTitle"/>
       </w:pPr>
       <w:r>
-        <w:rPr>
-          <w:noProof/>
-        </w:rPr>
-        <mc:AlternateContent>
-          <mc:Choice Requires="wpg">
-            <w:drawing>
-              <wp:anchor distT="0" distB="0" distL="114300" distR="114300" simplePos="0" relativeHeight="251659264" behindDoc="0" locked="0" layoutInCell="1" allowOverlap="1" wp14:anchorId="7BFD8613" wp14:editId="51AC4AEB">
-                <wp:simplePos x="914400" y="988695"/>
-                <wp:positionH relativeFrom="margin">
-                  <wp:align>center</wp:align>
-                </wp:positionH>
-                <wp:positionV relativeFrom="page">
-                  <wp:align>top</wp:align>
-                </wp:positionV>
-                <wp:extent cx="6793993" cy="4078224"/>
-                <wp:effectExtent l="0" t="0" r="6985" b="0"/>
-                <wp:wrapSquare wrapText="bothSides"/>
-                <wp:docPr id="1841149873" name="Group 1841149873"/>
-                <wp:cNvGraphicFramePr>
-                  <a:graphicFrameLocks xmlns:a="http://schemas.openxmlformats.org/drawingml/2006/main" noChangeAspect="1"/>
-                </wp:cNvGraphicFramePr>
-                <a:graphic xmlns:a="http://schemas.openxmlformats.org/drawingml/2006/main">
-                  <a:graphicData uri="http://schemas.microsoft.com/office/word/2010/wordprocessingGroup">
-                    <wpg:wgp>
-                      <wpg:cNvGrpSpPr>
-                        <a:grpSpLocks noChangeAspect="1"/>
-                      </wpg:cNvGrpSpPr>
-                      <wpg:grpSpPr>
-                        <a:xfrm>
-                          <a:off x="0" y="0"/>
-                          <a:ext cx="6793993" cy="4078224"/>
-                          <a:chOff x="-1" y="0"/>
-                          <a:chExt cx="6796141" cy="4080093"/>
-                        </a:xfrm>
-                      </wpg:grpSpPr>
-                      <pic:pic xmlns:pic="http://schemas.openxmlformats.org/drawingml/2006/picture">
-                        <pic:nvPicPr>
-                          <pic:cNvPr id="18093572" name="Picture 10" descr="See the source image"/>
-                          <pic:cNvPicPr preferRelativeResize="0">
-                            <a:picLocks noChangeAspect="1"/>
-                          </pic:cNvPicPr>
-                        </pic:nvPicPr>
-                        <pic:blipFill>
-                          <a:blip r:embed="rId8">
-                            <a:extLst>
-                              <a:ext uri="{28A0092B-C50C-407E-A947-70E740481C1C}">
-                                <a14:useLocalDpi xmlns:a14="http://schemas.microsoft.com/office/drawing/2010/main" val="0"/>
-                              </a:ext>
-                            </a:extLst>
-                          </a:blip>
-                          <a:stretch>
-                            <a:fillRect/>
-                          </a:stretch>
-                        </pic:blipFill>
-                        <pic:spPr bwMode="auto">
-                          <a:xfrm>
-                            <a:off x="-1" y="8894"/>
-                            <a:ext cx="3338615" cy="1966434"/>
-                          </a:xfrm>
-                          <a:prstGeom prst="rect">
-                            <a:avLst/>
-                          </a:prstGeom>
-                          <a:noFill/>
-                        </pic:spPr>
-                      </pic:pic>
-                      <pic:pic xmlns:pic="http://schemas.openxmlformats.org/drawingml/2006/picture">
-                        <pic:nvPicPr>
-                          <pic:cNvPr id="1849772849" name="Picture 11" descr="See the source image"/>
-                          <pic:cNvPicPr/>
-                        </pic:nvPicPr>
-                        <pic:blipFill rotWithShape="1">
-                          <a:blip r:embed="rId9" cstate="print">
-                            <a:extLst>
-                              <a:ext uri="{28A0092B-C50C-407E-A947-70E740481C1C}">
-                                <a14:useLocalDpi xmlns:a14="http://schemas.microsoft.com/office/drawing/2010/main" val="0"/>
-                              </a:ext>
-                            </a:extLst>
-                          </a:blip>
-                          <a:srcRect l="7816" r="8276"/>
-                          <a:stretch/>
-                        </pic:blipFill>
-                        <pic:spPr bwMode="auto">
-                          <a:xfrm>
-                            <a:off x="13648" y="2101755"/>
-                            <a:ext cx="3336290" cy="1964690"/>
-                          </a:xfrm>
-                          <a:prstGeom prst="rect">
-                            <a:avLst/>
-                          </a:prstGeom>
-                          <a:noFill/>
-                          <a:extLst>
-                            <a:ext uri="{53640926-AAD7-44D8-BBD7-CCE9431645EC}">
-                              <a14:shadowObscured xmlns:a14="http://schemas.microsoft.com/office/drawing/2010/main"/>
-                            </a:ext>
-                          </a:extLst>
-                        </pic:spPr>
-                      </pic:pic>
-                      <pic:pic xmlns:pic="http://schemas.openxmlformats.org/drawingml/2006/picture">
-                        <pic:nvPicPr>
-                          <pic:cNvPr id="1431708130" name="Picture 8" descr="See the source image"/>
-                          <pic:cNvPicPr/>
-                        </pic:nvPicPr>
-                        <pic:blipFill>
-                          <a:blip r:embed="rId10" cstate="print">
-                            <a:extLst>
-                              <a:ext uri="{28A0092B-C50C-407E-A947-70E740481C1C}">
-                                <a14:useLocalDpi xmlns:a14="http://schemas.microsoft.com/office/drawing/2010/main" val="0"/>
-                              </a:ext>
-                            </a:extLst>
-                          </a:blip>
-                          <a:stretch>
-                            <a:fillRect/>
-                          </a:stretch>
-                        </pic:blipFill>
-                        <pic:spPr bwMode="auto">
-                          <a:xfrm>
-                            <a:off x="3493827" y="0"/>
-                            <a:ext cx="3276600" cy="1964690"/>
-                          </a:xfrm>
-                          <a:prstGeom prst="rect">
-                            <a:avLst/>
-                          </a:prstGeom>
-                          <a:noFill/>
-                        </pic:spPr>
-                      </pic:pic>
-                      <pic:pic xmlns:pic="http://schemas.openxmlformats.org/drawingml/2006/picture">
-                        <pic:nvPicPr>
-                          <pic:cNvPr id="328241876" name="Picture 6" descr="See the source image"/>
-                          <pic:cNvPicPr/>
-                        </pic:nvPicPr>
-                        <pic:blipFill>
-                          <a:blip r:embed="rId11">
-                            <a:extLst>
-                              <a:ext uri="{28A0092B-C50C-407E-A947-70E740481C1C}">
-                                <a14:useLocalDpi xmlns:a14="http://schemas.microsoft.com/office/drawing/2010/main" val="0"/>
-                              </a:ext>
-                            </a:extLst>
-                          </a:blip>
-                          <a:stretch>
-                            <a:fillRect/>
-                          </a:stretch>
-                        </pic:blipFill>
-                        <pic:spPr bwMode="auto">
-                          <a:xfrm>
-                            <a:off x="3507475" y="2115403"/>
-                            <a:ext cx="3288665" cy="1964690"/>
-                          </a:xfrm>
-                          <a:prstGeom prst="rect">
-                            <a:avLst/>
-                          </a:prstGeom>
-                          <a:noFill/>
-                        </pic:spPr>
-                      </pic:pic>
-                    </wpg:wgp>
-                  </a:graphicData>
-                </a:graphic>
-                <wp14:sizeRelH relativeFrom="margin">
-                  <wp14:pctWidth>0</wp14:pctWidth>
-                </wp14:sizeRelH>
-                <wp14:sizeRelV relativeFrom="margin">
-                  <wp14:pctHeight>0</wp14:pctHeight>
-                </wp14:sizeRelV>
-              </wp:anchor>
-            </w:drawing>
-          </mc:Choice>
-          <mc:Fallback>
-            <w:pict>
-              <v:group w14:anchorId="6B58A5EA" id="Group 1841149873" o:spid="_x0000_s1026" style="position:absolute;margin-left:0;margin-top:0;width:534.95pt;height:321.1pt;z-index:251659264;mso-position-horizontal:center;mso-position-horizontal-relative:margin;mso-position-vertical:top;mso-position-vertical-relative:page;mso-width-relative:margin;mso-height-relative:margin" coordorigin="" coordsize="67961,40800" o:gfxdata="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">
-                <o:lock v:ext="edit" aspectratio="t"/>
-                <v:shapetype id="_x0000_t75" coordsize="21600,21600" o:spt="75" o:preferrelative="t" path="m@4@5l@4@11@9@11@9@5xe" filled="f" stroked="f">
-                  <v:stroke joinstyle="miter"/>
-                  <v:formulas>
-                    <v:f eqn="if lineDrawn pixelLineWidth 0"/>
-                    <v:f eqn="sum @0 1 0"/>
-                    <v:f eqn="sum 0 0 @1"/>
-                    <v:f eqn="prod @2 1 2"/>
-                    <v:f eqn="prod @3 21600 pixelWidth"/>
-                    <v:f eqn="prod @3 21600 pixelHeight"/>
-                    <v:f eqn="sum @0 0 1"/>
-                    <v:f eqn="prod @6 1 2"/>
-                    <v:f eqn="prod @7 21600 pixelWidth"/>
-                    <v:f eqn="sum @8 21600 0"/>
-                    <v:f eqn="prod @7 21600 pixelHeight"/>
-                    <v:f eqn="sum @10 21600 0"/>
-                  </v:formulas>
-                  <v:path o:extrusionok="f" gradientshapeok="t" o:connecttype="rect"/>
-                  <o:lock v:ext="edit" aspectratio="t"/>
-                </v:shapetype>
-                <v:shape id="Picture 10" o:spid="_x0000_s1027" type="#_x0000_t75" alt="See the source image" style="position:absolute;top:88;width:33386;height:19665;visibility:visible;mso-wrap-style:square" o:preferrelative="f" o:gfxdata="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">
-                  <v:imagedata r:id="rId12" o:title="See the source image"/>
-                </v:shape>
-                <v:shape id="Picture 11" o:spid="_x0000_s1028" type="#_x0000_t75" alt="See the source image" style="position:absolute;left:136;top:21017;width:33363;height:19647;visibility:visible;mso-wrap-style:square" o:gfxdata="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">
-                  <v:imagedata r:id="rId13" o:title="See the source image" cropleft="5122f" cropright="5424f"/>
-                </v:shape>
-                <v:shape id="Picture 8" o:spid="_x0000_s1029" type="#_x0000_t75" alt="See the source image" style="position:absolute;left:34938;width:32766;height:19646;visibility:visible;mso-wrap-style:square" o:gfxdata="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">
-                  <v:imagedata r:id="rId14" o:title="See the source image"/>
-                </v:shape>
-                <v:shape id="Picture 6" o:spid="_x0000_s1030" type="#_x0000_t75" alt="See the source image" style="position:absolute;left:35074;top:21154;width:32887;height:19646;visibility:visible;mso-wrap-style:square" o:gfxdata="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">
-                  <v:imagedata r:id="rId15" o:title="See the source image"/>
-                </v:shape>
-                <w10:wrap type="square" anchorx="margin" anchory="page"/>
-              </v:group>
-            </w:pict>
-          </mc:Fallback>
-        </mc:AlternateContent>
-      </w:r>
-      <w:r>
-        <w:t>Asset</w:t>
-      </w:r>
-      <w:r>
-        <w:t xml:space="preserve"> Dependency</w:t>
-      </w:r>
-      <w:r>
-        <w:t xml:space="preserve"> Assessment</w:t>
+        <w:t>Hotel Operational Security Toolkit (HOST)</w:t>
       </w:r>
     </w:p>
     <w:p>
@@ -1968,21 +1755,14 @@
                               <w:sz w:val="22"/>
                               <w:szCs w:val="22"/>
                             </w:rPr>
-                            <w:t>Asset</w:t>
+                            <w:t>Hotel Operational Security Toolkit</w:t>
                           </w:r>
                           <w:r>
                             <w:rPr>
                               <w:sz w:val="22"/>
                               <w:szCs w:val="22"/>
                             </w:rPr>
-                            <w:t xml:space="preserve"> Dependency</w:t>
-                          </w:r>
-                          <w:r>
-                            <w:rPr>
-                              <w:sz w:val="22"/>
-                              <w:szCs w:val="22"/>
-                            </w:rPr>
-                            <w:t xml:space="preserve"> Assessment</w:t>
+                            <w:t xml:space="preserve"> (HOST)</w:t>
                           </w:r>
                         </w:p>
                       </w:txbxContent>
@@ -2025,21 +1805,14 @@
                         <w:sz w:val="22"/>
                         <w:szCs w:val="22"/>
                       </w:rPr>
-                      <w:t>Asset</w:t>
+                      <w:t>Hotel Operational Security Toolkit</w:t>
                     </w:r>
                     <w:r>
                       <w:rPr>
                         <w:sz w:val="22"/>
                         <w:szCs w:val="22"/>
                       </w:rPr>
-                      <w:t xml:space="preserve"> Dependency</w:t>
-                    </w:r>
-                    <w:r>
-                      <w:rPr>
-                        <w:sz w:val="22"/>
-                        <w:szCs w:val="22"/>
-                      </w:rPr>
-                      <w:t xml:space="preserve"> Assessment</w:t>
+                      <w:t xml:space="preserve"> (HOST)</w:t>
                     </w:r>
                   </w:p>
                 </w:txbxContent>

</xml_diff>